<commit_message>
Corrige nome do professor e inicial maiúscula do subtítulo no relatório
Co-Authored-By: Claude Opus 5.5 <noreply@anthropic.com>
Claude-Session: https://claude.ai/code/session_01LZ56SgenUgwYN3RMa5pNSZ
</commit_message>
<xml_diff>
--- a/Relatorio_Apagao_2015_SEP.docx
+++ b/Relatorio_Apagao_2015_SEP.docx
@@ -181,7 +181,7 @@
           <w:b w:val="0"/>
           <w:i w:val="0"/>
         </w:rPr>
-        <w:t>análise da perturbação no Sistema Interligado Nacional à luz dos Sistemas Elétricos de Potência</w:t>
+        <w:t>Análise da perturbação no Sistema Interligado Nacional à luz dos Sistemas Elétricos de Potência</w:t>
       </w:r>
     </w:p>
     <w:p>
@@ -430,7 +430,7 @@
           <w:b w:val="0"/>
           <w:i w:val="0"/>
         </w:rPr>
-        <w:t>análise da perturbação no Sistema Interligado Nacional à luz dos Sistemas Elétricos de Potência</w:t>
+        <w:t>Análise da perturbação no Sistema Interligado Nacional à luz dos Sistemas Elétricos de Potência</w:t>
       </w:r>
     </w:p>
     <w:p>
@@ -486,7 +486,7 @@
           <w:b w:val="0"/>
           <w:i w:val="0"/>
         </w:rPr>
-        <w:t>Professor: Jorge</w:t>
+        <w:t>Professor: Jorge Lourenço</w:t>
       </w:r>
     </w:p>
     <w:p>

</xml_diff>